<commit_message>
Lab 5: add report.md, fix title page
</commit_message>
<xml_diff>
--- a/lab5/Raport_Lab5_SO.docx
+++ b/lab5/Raport_Lab5_SO.docx
@@ -171,7 +171,7 @@
           <w:b/>
           <w:bCs/>
         </w:rPr>
-        <w:t xml:space="preserve">Dulgheru Ion, grupa [grupa]</w:t>
+        <w:t xml:space="preserve">Done by: st. gr. FAF-241, Dulgheru Ion</w:t>
       </w:r>
     </w:p>
     <w:p>
@@ -321,7 +321,7 @@
         <w:jc w:val="left"/>
       </w:pPr>
       <w:r>
-        <w:t xml:space="preserve">Verificat de: [Nume Prenume profesor]</w:t>
+        <w:t xml:space="preserve">Checked by: Reitman Patricia</w:t>
       </w:r>
     </w:p>
     <w:p>

</xml_diff>